<commit_message>
Fix Olist project metric definitions and outputs
- Clarify order and customer metric definitions
- Fix order-level cancellation rate calculation
- Standardize delivery delay logic
- Clean category unknown handling
- Update SQL output Excel files for modules 01, 03, 04 and 05
- Rename RFM SQL file and align README/report wording
</commit_message>
<xml_diff>
--- a/docs/巴西电商平台SQL数据分析项目报告_最终版.docx
+++ b/docs/巴西电商平台SQL数据分析项目报告_最终版.docx
@@ -105,8 +105,6 @@
         </w:rPr>
         <w:br w:type="textWrapping"/>
       </w:r>
-      <w:bookmarkStart w:id="0" w:name="_GoBack"/>
-      <w:bookmarkEnd w:id="0"/>
     </w:p>
     <w:p>
       <w:pPr>
@@ -155,7 +153,15 @@
         <w:rPr>
           <w:rFonts w:hint="eastAsia" w:ascii="微软雅黑" w:hAnsi="微软雅黑" w:eastAsia="微软雅黑" w:cs="微软雅黑"/>
         </w:rPr>
-        <w:t>报告采用的核心指标包括 GMV、订单量、AOV、平均评分、延迟率、支付方式占比和 RFM 用户分层结果。成交类指标主要排除 canceled 与 unavailable 订单；用户识别使用 customer_unique_id；GMV 口径为商品价格与运费之和。</w:t>
+        <w:t>报告采用的核心指标包括 GMV、订单量、AOV、平均评分、延迟率、支付方式占比和 RFM 用户分层结果。成交类指标主要排除 canceled 与 un</w:t>
+      </w:r>
+      <w:bookmarkStart w:id="0" w:name="_GoBack"/>
+      <w:bookmarkEnd w:id="0"/>
+      <w:r>
+        <w:rPr>
+          <w:rFonts w:hint="eastAsia" w:ascii="微软雅黑" w:hAnsi="微软雅黑" w:eastAsia="微软雅黑" w:cs="微软雅黑"/>
+        </w:rPr>
+        <w:t>available 订单；用户识别使用 customer_unique_id；GMV 口径为商品价格与运费之和。</w:t>
       </w:r>
     </w:p>
     <w:p>
@@ -183,7 +189,22 @@
         <w:rPr>
           <w:rFonts w:hint="eastAsia" w:ascii="微软雅黑" w:hAnsi="微软雅黑" w:eastAsia="微软雅黑" w:cs="微软雅黑"/>
         </w:rPr>
-        <w:t>平台整体交易规模较大：有效订单约 98,666 单，总 GMV 约 1,591.59 万雷亚尔，AOV 为 161.31 雷亚尔。</w:t>
+        <w:t>平台整体交易规模较大：</w:t>
+      </w:r>
+      <w:r>
+        <w:rPr>
+          <w:rFonts w:hint="eastAsia" w:ascii="微软雅黑" w:hAnsi="微软雅黑" w:eastAsia="微软雅黑" w:cs="微软雅黑"/>
+          <w:sz w:val="21"/>
+          <w:szCs w:val="22"/>
+          <w:lang w:val="en-US" w:eastAsia="en-US" w:bidi="ar-SA"/>
+        </w:rPr>
+        <w:t>有商品明细的订单数为 98,666 单</w:t>
+      </w:r>
+      <w:r>
+        <w:rPr>
+          <w:rFonts w:hint="eastAsia" w:ascii="微软雅黑" w:hAnsi="微软雅黑" w:eastAsia="微软雅黑" w:cs="微软雅黑"/>
+        </w:rPr>
+        <w:t>，总 GMV 约 1,591.59 万雷亚尔，AOV 为 161.31 雷亚尔。</w:t>
       </w:r>
     </w:p>
     <w:p>
@@ -334,12 +355,6 @@
             <w:insideH w:val="single" w:color="auto" w:sz="4" w:space="0"/>
             <w:insideV w:val="single" w:color="auto" w:sz="4" w:space="0"/>
           </w:tblBorders>
-          <w:tblCellMar>
-            <w:top w:w="0" w:type="dxa"/>
-            <w:left w:w="108" w:type="dxa"/>
-            <w:bottom w:w="0" w:type="dxa"/>
-            <w:right w:w="108" w:type="dxa"/>
-          </w:tblCellMar>
         </w:tblPrEx>
         <w:trPr>
           <w:jc w:val="center"/>
@@ -1287,12 +1302,6 @@
             <w:insideH w:val="single" w:color="auto" w:sz="4" w:space="0"/>
             <w:insideV w:val="single" w:color="auto" w:sz="4" w:space="0"/>
           </w:tblBorders>
-          <w:tblCellMar>
-            <w:top w:w="0" w:type="dxa"/>
-            <w:left w:w="108" w:type="dxa"/>
-            <w:bottom w:w="0" w:type="dxa"/>
-            <w:right w:w="108" w:type="dxa"/>
-          </w:tblCellMar>
         </w:tblPrEx>
         <w:trPr>
           <w:jc w:val="center"/>
@@ -6692,12 +6701,6 @@
             <w:insideH w:val="single" w:color="auto" w:sz="4" w:space="0"/>
             <w:insideV w:val="single" w:color="auto" w:sz="4" w:space="0"/>
           </w:tblBorders>
-          <w:tblCellMar>
-            <w:top w:w="0" w:type="dxa"/>
-            <w:left w:w="108" w:type="dxa"/>
-            <w:bottom w:w="0" w:type="dxa"/>
-            <w:right w:w="108" w:type="dxa"/>
-          </w:tblCellMar>
         </w:tblPrEx>
         <w:trPr>
           <w:jc w:val="center"/>
@@ -13517,12 +13520,6 @@
             <w:insideH w:val="single" w:color="auto" w:sz="4" w:space="0"/>
             <w:insideV w:val="single" w:color="auto" w:sz="4" w:space="0"/>
           </w:tblBorders>
-          <w:tblCellMar>
-            <w:top w:w="0" w:type="dxa"/>
-            <w:left w:w="108" w:type="dxa"/>
-            <w:bottom w:w="0" w:type="dxa"/>
-            <w:right w:w="108" w:type="dxa"/>
-          </w:tblCellMar>
         </w:tblPrEx>
         <w:trPr>
           <w:jc w:val="center"/>
@@ -26618,7 +26615,7 @@
   <w:docDefaults>
     <w:rPrDefault>
       <w:rPr>
-        <w:rFonts w:asciiTheme="minorHAnsi" w:hAnsiTheme="minorHAnsi" w:eastAsiaTheme="minorEastAsia" w:cstheme="minorBidi"/>
+        <w:rFonts w:ascii="Times New Roman" w:hAnsi="Times New Roman" w:eastAsia="宋体" w:cs="Times New Roman"/>
       </w:rPr>
     </w:rPrDefault>
     <w:pPrDefault/>

</xml_diff>